<commit_message>
refactor(v0.04): NpcCognitiveModulators — risolve omonimia Resilience01
Rinomina Resilience01 → StressResilience01 (resilienza psicologica allo stress
di ruolo, distinta dalla memoria). Aggiunge 4 campi memoria-individuali assorbiti
da PersonalityMemoryParams: MemoryResilience01, TraumaSensitivity01, Rumination01,
Gullibility01. Aggiorna docx: tabella modulatori cognitivi + descrizione DNA.

https://claude.ai/code/session_015EsD5URwjzX7pPyACyqeNb
</commit_message>
<xml_diff>
--- a/ARCONTIO NPC Architecture v2.docx
+++ b/ARCONTIO NPC Architecture v2.docx
@@ -1631,7 +1631,7 @@
                 <w:sz w:val="20"/>
                 <w:szCs w:val="20"/>
               </w:rPr>
-              <w:t xml:space="preserve">Parametri cognitivi immutabili: impulsività, avversione al rischio, conformismo, ecc.</w:t>
+              <w:t>Parametri cognitivi immutabili: impulsività, avversione al rischio, conformismo, ottimismo/pessimismo, resilienza-stress, resilienza-memoria, socievolezza, drift resistance, sensibilità al trauma, rumination, gullibility.</w:t>
             </w:r>
           </w:p>
         </w:tc>
@@ -3986,7 +3986,7 @@
                 <w:sz w:val="20"/>
                 <w:szCs w:val="20"/>
               </w:rPr>
-              <w:t xml:space="preserve">Resilienza</w:t>
+              <w:t>Resilienza allo Stress</w:t>
             </w:r>
           </w:p>
         </w:tc>
@@ -4073,7 +4073,7 @@
                 <w:sz w:val="20"/>
                 <w:szCs w:val="20"/>
               </w:rPr>
-              <w:t xml:space="preserve">—</w:t>
+              <w:t>—</w:t>
             </w:r>
           </w:p>
         </w:tc>
@@ -4195,6 +4195,490 @@
                 <w:szCs w:val="20"/>
               </w:rPr>
               <w:t xml:space="preserve">—</w:t>
+            </w:r>
+          </w:p>
+        </w:tc>
+      </w:tr>
+      <w:tr>
+        <w:trPr>
+          <w:tblHeader w:val="false"/>
+        </w:trPr>
+        <w:tc>
+          <w:tcPr>
+            <w:tcW w:type="dxa" w:w="2000"/>
+            <w:tcBorders>
+              <w:top w:val="single" w:color="CCCCCC" w:sz="1"/>
+              <w:left w:val="single" w:color="CCCCCC" w:sz="1"/>
+              <w:bottom w:val="single" w:color="CCCCCC" w:sz="1"/>
+              <w:right w:val="single" w:color="CCCCCC" w:sz="1"/>
+            </w:tcBorders>
+            <w:shd w:fill="EAF2FB" w:val="clear"/>
+            <w:tcMar>
+              <w:top w:type="dxa" w:w="80"/>
+              <w:left w:type="dxa" w:w="140"/>
+              <w:bottom w:type="dxa" w:w="80"/>
+              <w:right w:type="dxa" w:w="140"/>
+            </w:tcMar>
+          </w:tcPr>
+          <w:p>
+            <w:r>
+              <w:rPr>
+                <w:rFonts w:ascii="Arial" w:cs="Arial" w:eastAsia="Arial" w:hAnsi="Arial"/>
+                <w:color w:val="1A1A1A"/>
+                <w:sz w:val="20"/>
+                <w:szCs w:val="20"/>
+              </w:rPr>
+              <w:t>Resilienza di Memoria</w:t>
+            </w:r>
+          </w:p>
+        </w:tc>
+        <w:tc>
+          <w:tcPr>
+            <w:tcW w:type="dxa" w:w="2320"/>
+            <w:tcBorders>
+              <w:top w:val="single" w:color="CCCCCC" w:sz="1"/>
+              <w:left w:val="single" w:color="CCCCCC" w:sz="1"/>
+              <w:bottom w:val="single" w:color="CCCCCC" w:sz="1"/>
+              <w:right w:val="single" w:color="CCCCCC" w:sz="1"/>
+            </w:tcBorders>
+            <w:shd w:fill="EAF2FB" w:val="clear"/>
+            <w:tcMar>
+              <w:top w:type="dxa" w:w="80"/>
+              <w:left w:type="dxa" w:w="140"/>
+              <w:bottom w:type="dxa" w:w="80"/>
+              <w:right w:type="dxa" w:w="140"/>
+            </w:tcMar>
+          </w:tcPr>
+          <w:p>
+            <w:r>
+              <w:rPr>
+                <w:rFonts w:ascii="Arial" w:cs="Arial" w:eastAsia="Arial" w:hAnsi="Arial"/>
+                <w:color w:val="1A1A1A"/>
+                <w:sz w:val="20"/>
+                <w:szCs w:val="20"/>
+              </w:rPr>
+              <w:t>—</w:t>
+            </w:r>
+          </w:p>
+        </w:tc>
+        <w:tc>
+          <w:tcPr>
+            <w:tcW w:type="dxa" w:w="2320"/>
+            <w:tcBorders>
+              <w:top w:val="single" w:color="CCCCCC" w:sz="1"/>
+              <w:left w:val="single" w:color="CCCCCC" w:sz="1"/>
+              <w:bottom w:val="single" w:color="CCCCCC" w:sz="1"/>
+              <w:right w:val="single" w:color="CCCCCC" w:sz="1"/>
+            </w:tcBorders>
+            <w:shd w:fill="EAF2FB" w:val="clear"/>
+            <w:tcMar>
+              <w:top w:type="dxa" w:w="80"/>
+              <w:left w:type="dxa" w:w="140"/>
+              <w:bottom w:type="dxa" w:w="80"/>
+              <w:right w:type="dxa" w:w="140"/>
+            </w:tcMar>
+          </w:tcPr>
+          <w:p>
+            <w:r>
+              <w:rPr>
+                <w:rFonts w:ascii="Arial" w:cs="Arial" w:eastAsia="Arial" w:hAnsi="Arial"/>
+                <w:color w:val="1A1A1A"/>
+                <w:sz w:val="20"/>
+                <w:szCs w:val="20"/>
+              </w:rPr>
+              <w:t>—</w:t>
+            </w:r>
+          </w:p>
+        </w:tc>
+        <w:tc>
+          <w:tcPr>
+            <w:tcW w:type="dxa" w:w="2720"/>
+            <w:tcBorders>
+              <w:top w:val="single" w:color="CCCCCC" w:sz="1"/>
+              <w:left w:val="single" w:color="CCCCCC" w:sz="1"/>
+              <w:bottom w:val="single" w:color="CCCCCC" w:sz="1"/>
+              <w:right w:val="single" w:color="CCCCCC" w:sz="1"/>
+            </w:tcBorders>
+            <w:shd w:fill="EAF2FB" w:val="clear"/>
+            <w:tcMar>
+              <w:top w:type="dxa" w:w="80"/>
+              <w:left w:type="dxa" w:w="140"/>
+              <w:bottom w:type="dxa" w:w="80"/>
+              <w:right w:type="dxa" w:w="140"/>
+            </w:tcMar>
+          </w:tcPr>
+          <w:p>
+            <w:r>
+              <w:rPr>
+                <w:rFonts w:ascii="Arial" w:cs="Arial" w:eastAsia="Arial" w:hAnsi="Arial"/>
+                <w:color w:val="1A1A1A"/>
+                <w:sz w:val="20"/>
+                <w:szCs w:val="20"/>
+              </w:rPr>
+              <w:t>Modula decay delle tracce traumatiche (MemoryResilience01 → PersonalityMemoryParams.Resilience01)</w:t>
+            </w:r>
+          </w:p>
+        </w:tc>
+      </w:tr>
+      <w:tr>
+        <w:trPr>
+          <w:tblHeader w:val="false"/>
+        </w:trPr>
+        <w:tc>
+          <w:tcPr>
+            <w:tcW w:type="dxa" w:w="2000"/>
+            <w:tcBorders>
+              <w:top w:val="single" w:color="CCCCCC" w:sz="1"/>
+              <w:left w:val="single" w:color="CCCCCC" w:sz="1"/>
+              <w:bottom w:val="single" w:color="CCCCCC" w:sz="1"/>
+              <w:right w:val="single" w:color="CCCCCC" w:sz="1"/>
+            </w:tcBorders>
+            <w:shd w:fill="EAF2FB" w:val="clear"/>
+            <w:tcMar>
+              <w:top w:type="dxa" w:w="80"/>
+              <w:left w:type="dxa" w:w="140"/>
+              <w:bottom w:type="dxa" w:w="80"/>
+              <w:right w:type="dxa" w:w="140"/>
+            </w:tcMar>
+          </w:tcPr>
+          <w:p>
+            <w:r>
+              <w:rPr>
+                <w:rFonts w:ascii="Arial" w:cs="Arial" w:eastAsia="Arial" w:hAnsi="Arial"/>
+                <w:color w:val="1A1A1A"/>
+                <w:sz w:val="20"/>
+                <w:szCs w:val="20"/>
+              </w:rPr>
+              <w:t>Sensibilità al Trauma</w:t>
+            </w:r>
+          </w:p>
+        </w:tc>
+        <w:tc>
+          <w:tcPr>
+            <w:tcW w:type="dxa" w:w="2320"/>
+            <w:tcBorders>
+              <w:top w:val="single" w:color="CCCCCC" w:sz="1"/>
+              <w:left w:val="single" w:color="CCCCCC" w:sz="1"/>
+              <w:bottom w:val="single" w:color="CCCCCC" w:sz="1"/>
+              <w:right w:val="single" w:color="CCCCCC" w:sz="1"/>
+            </w:tcBorders>
+            <w:shd w:fill="EAF2FB" w:val="clear"/>
+            <w:tcMar>
+              <w:top w:type="dxa" w:w="80"/>
+              <w:left w:type="dxa" w:w="140"/>
+              <w:bottom w:type="dxa" w:w="80"/>
+              <w:right w:type="dxa" w:w="140"/>
+            </w:tcMar>
+          </w:tcPr>
+          <w:p>
+            <w:r>
+              <w:rPr>
+                <w:rFonts w:ascii="Arial" w:cs="Arial" w:eastAsia="Arial" w:hAnsi="Arial"/>
+                <w:color w:val="1A1A1A"/>
+                <w:sz w:val="20"/>
+                <w:szCs w:val="20"/>
+              </w:rPr>
+              <w:t>—</w:t>
+            </w:r>
+          </w:p>
+        </w:tc>
+        <w:tc>
+          <w:tcPr>
+            <w:tcW w:type="dxa" w:w="2320"/>
+            <w:tcBorders>
+              <w:top w:val="single" w:color="CCCCCC" w:sz="1"/>
+              <w:left w:val="single" w:color="CCCCCC" w:sz="1"/>
+              <w:bottom w:val="single" w:color="CCCCCC" w:sz="1"/>
+              <w:right w:val="single" w:color="CCCCCC" w:sz="1"/>
+            </w:tcBorders>
+            <w:shd w:fill="EAF2FB" w:val="clear"/>
+            <w:tcMar>
+              <w:top w:type="dxa" w:w="80"/>
+              <w:left w:type="dxa" w:w="140"/>
+              <w:bottom w:type="dxa" w:w="80"/>
+              <w:right w:type="dxa" w:w="140"/>
+            </w:tcMar>
+          </w:tcPr>
+          <w:p>
+            <w:r>
+              <w:rPr>
+                <w:rFonts w:ascii="Arial" w:cs="Arial" w:eastAsia="Arial" w:hAnsi="Arial"/>
+                <w:color w:val="1A1A1A"/>
+                <w:sz w:val="20"/>
+                <w:szCs w:val="20"/>
+              </w:rPr>
+              <w:t>—</w:t>
+            </w:r>
+          </w:p>
+        </w:tc>
+        <w:tc>
+          <w:tcPr>
+            <w:tcW w:type="dxa" w:w="2720"/>
+            <w:tcBorders>
+              <w:top w:val="single" w:color="CCCCCC" w:sz="1"/>
+              <w:left w:val="single" w:color="CCCCCC" w:sz="1"/>
+              <w:bottom w:val="single" w:color="CCCCCC" w:sz="1"/>
+              <w:right w:val="single" w:color="CCCCCC" w:sz="1"/>
+            </w:tcBorders>
+            <w:shd w:fill="EAF2FB" w:val="clear"/>
+            <w:tcMar>
+              <w:top w:type="dxa" w:w="80"/>
+              <w:left w:type="dxa" w:w="140"/>
+              <w:bottom w:type="dxa" w:w="80"/>
+              <w:right w:type="dxa" w:w="140"/>
+            </w:tcMar>
+          </w:tcPr>
+          <w:p>
+            <w:r>
+              <w:rPr>
+                <w:rFonts w:ascii="Arial" w:cs="Arial" w:eastAsia="Arial" w:hAnsi="Arial"/>
+                <w:color w:val="1A1A1A"/>
+                <w:sz w:val="20"/>
+                <w:szCs w:val="20"/>
+              </w:rPr>
+              <w:t>Aumenta intensità iniziale delle tracce traumatiche (TraumaSensitivity01)</w:t>
+            </w:r>
+          </w:p>
+        </w:tc>
+      </w:tr>
+      <w:tr>
+        <w:trPr>
+          <w:tblHeader w:val="false"/>
+        </w:trPr>
+        <w:tc>
+          <w:tcPr>
+            <w:tcW w:type="dxa" w:w="2000"/>
+            <w:tcBorders>
+              <w:top w:val="single" w:color="CCCCCC" w:sz="1"/>
+              <w:left w:val="single" w:color="CCCCCC" w:sz="1"/>
+              <w:bottom w:val="single" w:color="CCCCCC" w:sz="1"/>
+              <w:right w:val="single" w:color="CCCCCC" w:sz="1"/>
+            </w:tcBorders>
+            <w:shd w:fill="EAF2FB" w:val="clear"/>
+            <w:tcMar>
+              <w:top w:type="dxa" w:w="80"/>
+              <w:left w:type="dxa" w:w="140"/>
+              <w:bottom w:type="dxa" w:w="80"/>
+              <w:right w:type="dxa" w:w="140"/>
+            </w:tcMar>
+          </w:tcPr>
+          <w:p>
+            <w:r>
+              <w:rPr>
+                <w:rFonts w:ascii="Arial" w:cs="Arial" w:eastAsia="Arial" w:hAnsi="Arial"/>
+                <w:color w:val="1A1A1A"/>
+                <w:sz w:val="20"/>
+                <w:szCs w:val="20"/>
+              </w:rPr>
+              <w:t>Rumination</w:t>
+            </w:r>
+          </w:p>
+        </w:tc>
+        <w:tc>
+          <w:tcPr>
+            <w:tcW w:type="dxa" w:w="2320"/>
+            <w:tcBorders>
+              <w:top w:val="single" w:color="CCCCCC" w:sz="1"/>
+              <w:left w:val="single" w:color="CCCCCC" w:sz="1"/>
+              <w:bottom w:val="single" w:color="CCCCCC" w:sz="1"/>
+              <w:right w:val="single" w:color="CCCCCC" w:sz="1"/>
+            </w:tcBorders>
+            <w:shd w:fill="EAF2FB" w:val="clear"/>
+            <w:tcMar>
+              <w:top w:type="dxa" w:w="80"/>
+              <w:left w:type="dxa" w:w="140"/>
+              <w:bottom w:type="dxa" w:w="80"/>
+              <w:right w:type="dxa" w:w="140"/>
+            </w:tcMar>
+          </w:tcPr>
+          <w:p>
+            <w:r>
+              <w:rPr>
+                <w:rFonts w:ascii="Arial" w:cs="Arial" w:eastAsia="Arial" w:hAnsi="Arial"/>
+                <w:color w:val="1A1A1A"/>
+                <w:sz w:val="20"/>
+                <w:szCs w:val="20"/>
+              </w:rPr>
+              <w:t>—</w:t>
+            </w:r>
+          </w:p>
+        </w:tc>
+        <w:tc>
+          <w:tcPr>
+            <w:tcW w:type="dxa" w:w="2320"/>
+            <w:tcBorders>
+              <w:top w:val="single" w:color="CCCCCC" w:sz="1"/>
+              <w:left w:val="single" w:color="CCCCCC" w:sz="1"/>
+              <w:bottom w:val="single" w:color="CCCCCC" w:sz="1"/>
+              <w:right w:val="single" w:color="CCCCCC" w:sz="1"/>
+            </w:tcBorders>
+            <w:shd w:fill="EAF2FB" w:val="clear"/>
+            <w:tcMar>
+              <w:top w:type="dxa" w:w="80"/>
+              <w:left w:type="dxa" w:w="140"/>
+              <w:bottom w:type="dxa" w:w="80"/>
+              <w:right w:type="dxa" w:w="140"/>
+            </w:tcMar>
+          </w:tcPr>
+          <w:p>
+            <w:r>
+              <w:rPr>
+                <w:rFonts w:ascii="Arial" w:cs="Arial" w:eastAsia="Arial" w:hAnsi="Arial"/>
+                <w:color w:val="1A1A1A"/>
+                <w:sz w:val="20"/>
+                <w:szCs w:val="20"/>
+              </w:rPr>
+              <w:t>—</w:t>
+            </w:r>
+          </w:p>
+        </w:tc>
+        <w:tc>
+          <w:tcPr>
+            <w:tcW w:type="dxa" w:w="2720"/>
+            <w:tcBorders>
+              <w:top w:val="single" w:color="CCCCCC" w:sz="1"/>
+              <w:left w:val="single" w:color="CCCCCC" w:sz="1"/>
+              <w:bottom w:val="single" w:color="CCCCCC" w:sz="1"/>
+              <w:right w:val="single" w:color="CCCCCC" w:sz="1"/>
+            </w:tcBorders>
+            <w:shd w:fill="EAF2FB" w:val="clear"/>
+            <w:tcMar>
+              <w:top w:type="dxa" w:w="80"/>
+              <w:left w:type="dxa" w:w="140"/>
+              <w:bottom w:type="dxa" w:w="80"/>
+              <w:right w:type="dxa" w:w="140"/>
+            </w:tcMar>
+          </w:tcPr>
+          <w:p>
+            <w:r>
+              <w:rPr>
+                <w:rFonts w:ascii="Arial" w:cs="Arial" w:eastAsia="Arial" w:hAnsi="Arial"/>
+                <w:color w:val="1A1A1A"/>
+                <w:sz w:val="20"/>
+                <w:szCs w:val="20"/>
+              </w:rPr>
+              <w:t>Riduce il decay rate delle memorie intense (Rumination01)</w:t>
+            </w:r>
+          </w:p>
+        </w:tc>
+      </w:tr>
+      <w:tr>
+        <w:trPr>
+          <w:tblHeader w:val="false"/>
+        </w:trPr>
+        <w:tc>
+          <w:tcPr>
+            <w:tcW w:type="dxa" w:w="2000"/>
+            <w:tcBorders>
+              <w:top w:val="single" w:color="CCCCCC" w:sz="1"/>
+              <w:left w:val="single" w:color="CCCCCC" w:sz="1"/>
+              <w:bottom w:val="single" w:color="CCCCCC" w:sz="1"/>
+              <w:right w:val="single" w:color="CCCCCC" w:sz="1"/>
+            </w:tcBorders>
+            <w:shd w:fill="EAF2FB" w:val="clear"/>
+            <w:tcMar>
+              <w:top w:type="dxa" w:w="80"/>
+              <w:left w:type="dxa" w:w="140"/>
+              <w:bottom w:type="dxa" w:w="80"/>
+              <w:right w:type="dxa" w:w="140"/>
+            </w:tcMar>
+          </w:tcPr>
+          <w:p>
+            <w:r>
+              <w:rPr>
+                <w:rFonts w:ascii="Arial" w:cs="Arial" w:eastAsia="Arial" w:hAnsi="Arial"/>
+                <w:color w:val="1A1A1A"/>
+                <w:sz w:val="20"/>
+                <w:szCs w:val="20"/>
+              </w:rPr>
+              <w:t>Gullibility</w:t>
+            </w:r>
+          </w:p>
+        </w:tc>
+        <w:tc>
+          <w:tcPr>
+            <w:tcW w:type="dxa" w:w="2320"/>
+            <w:tcBorders>
+              <w:top w:val="single" w:color="CCCCCC" w:sz="1"/>
+              <w:left w:val="single" w:color="CCCCCC" w:sz="1"/>
+              <w:bottom w:val="single" w:color="CCCCCC" w:sz="1"/>
+              <w:right w:val="single" w:color="CCCCCC" w:sz="1"/>
+            </w:tcBorders>
+            <w:shd w:fill="EAF2FB" w:val="clear"/>
+            <w:tcMar>
+              <w:top w:type="dxa" w:w="80"/>
+              <w:left w:type="dxa" w:w="140"/>
+              <w:bottom w:type="dxa" w:w="80"/>
+              <w:right w:type="dxa" w:w="140"/>
+            </w:tcMar>
+          </w:tcPr>
+          <w:p>
+            <w:r>
+              <w:rPr>
+                <w:rFonts w:ascii="Arial" w:cs="Arial" w:eastAsia="Arial" w:hAnsi="Arial"/>
+                <w:color w:val="1A1A1A"/>
+                <w:sz w:val="20"/>
+                <w:szCs w:val="20"/>
+              </w:rPr>
+              <w:t>—</w:t>
+            </w:r>
+          </w:p>
+        </w:tc>
+        <w:tc>
+          <w:tcPr>
+            <w:tcW w:type="dxa" w:w="2320"/>
+            <w:tcBorders>
+              <w:top w:val="single" w:color="CCCCCC" w:sz="1"/>
+              <w:left w:val="single" w:color="CCCCCC" w:sz="1"/>
+              <w:bottom w:val="single" w:color="CCCCCC" w:sz="1"/>
+              <w:right w:val="single" w:color="CCCCCC" w:sz="1"/>
+            </w:tcBorders>
+            <w:shd w:fill="EAF2FB" w:val="clear"/>
+            <w:tcMar>
+              <w:top w:type="dxa" w:w="80"/>
+              <w:left w:type="dxa" w:w="140"/>
+              <w:bottom w:type="dxa" w:w="80"/>
+              <w:right w:type="dxa" w:w="140"/>
+            </w:tcMar>
+          </w:tcPr>
+          <w:p>
+            <w:r>
+              <w:rPr>
+                <w:rFonts w:ascii="Arial" w:cs="Arial" w:eastAsia="Arial" w:hAnsi="Arial"/>
+                <w:color w:val="1A1A1A"/>
+                <w:sz w:val="20"/>
+                <w:szCs w:val="20"/>
+              </w:rPr>
+              <w:t>—</w:t>
+            </w:r>
+          </w:p>
+        </w:tc>
+        <w:tc>
+          <w:tcPr>
+            <w:tcW w:type="dxa" w:w="2720"/>
+            <w:tcBorders>
+              <w:top w:val="single" w:color="CCCCCC" w:sz="1"/>
+              <w:left w:val="single" w:color="CCCCCC" w:sz="1"/>
+              <w:bottom w:val="single" w:color="CCCCCC" w:sz="1"/>
+              <w:right w:val="single" w:color="CCCCCC" w:sz="1"/>
+            </w:tcBorders>
+            <w:shd w:fill="EAF2FB" w:val="clear"/>
+            <w:tcMar>
+              <w:top w:type="dxa" w:w="80"/>
+              <w:left w:type="dxa" w:w="140"/>
+              <w:bottom w:type="dxa" w:w="80"/>
+              <w:right w:type="dxa" w:w="140"/>
+            </w:tcMar>
+          </w:tcPr>
+          <w:p>
+            <w:r>
+              <w:rPr>
+                <w:rFonts w:ascii="Arial" w:cs="Arial" w:eastAsia="Arial" w:hAnsi="Arial"/>
+                <w:color w:val="1A1A1A"/>
+                <w:sz w:val="20"/>
+                <w:szCs w:val="20"/>
+              </w:rPr>
+              <w:t>Abbassa la soglia di accettazione dei rumor nel token assimilation (Gullibility01)</w:t>
             </w:r>
           </w:p>
         </w:tc>

</xml_diff>

<commit_message>
docs: aggiunge sessione v0.04.09 PhysicalProfile, slitta sessioni 09→19
ARCONTIO_Roadmap_Notion.md:
  - Sessioni 07 e 08 marcate ✅
  - Nuova sessione 09: NpcProfile — PhysicalProfile (Strength, Endurance, Agility, Intelligence)
  - Sessioni precedenti 09→18 slittate a 10→19
  - Definition of Done v0.04: aggiunta riga PhysicalProfile
  - Riepilogo: v0.04 aggiornato da 18 a 19 sessioni (6→7 settimane)

ARCONTIO NPC Architecture v2.docx:
  - Table NpcDnaProfile: Capacities — aggiunta nota su corrispettivo mutabile PhysicalProfile
  - Table NpcProfile: aggiunta riga PhysicalProfile con descrizione completa
  - Paragrafo 3.2: aggiunta frase introduttiva su PhysicalProfile (v0.04.09)

https://claude.ai/code/session_015EsD5URwjzX7pPyACyqeNb
</commit_message>
<xml_diff>
--- a/ARCONTIO NPC Architecture v2.docx
+++ b/ARCONTIO NPC Architecture v2.docx
@@ -1253,7 +1253,7 @@
                 <w:sz w:val="20"/>
                 <w:szCs w:val="20"/>
               </w:rPr>
-              <w:t xml:space="preserve">Capacità fisiche e cognitive strutturali (forza, resistenza, intelligenza di base)</w:t>
+              <w:t>Capacità fisiche e cognitive strutturali (forza, resistenza, intelligenza di base) — ha un corrispettivo mutabile in NpcProfile.PhysicalProfile (v0.04.09).</w:t>
             </w:r>
           </w:p>
         </w:tc>
@@ -1872,6 +1872,9 @@
           <w:szCs w:val="22"/>
         </w:rPr>
         <w:t xml:space="preserve">Separato dal DNA, ogni NPC ha un NpcProfile che contiene i dati personali che cambiano durante la simulazione. È inizializzato a partire dai seed del DNA ma evolve con l'esperienza, le relazioni e i ruoli assegnati.</w:t>
+      </w:r>
+      <w:r>
+        <w:t xml:space="preserve"> A partire dalla v0.04.09, NpcProfile include anche PhysicalProfile: i tratti fisici (Strength, Endurance, Agility, Intelligence) che variano in funzione dell'esperienza, dell'esercizio e dell'inattività, con cap superiore definito da NpcCapacities nel DNA.</w:t>
       </w:r>
     </w:p>
     <w:p>
@@ -2236,6 +2239,69 @@
                 <w:szCs w:val="20"/>
               </w:rPr>
               <w:t xml:space="preserve">Etichetta del ruolo assegnato istituzionalmente. Nullable. Non deriva automaticamente dalla competenza più alta.</w:t>
+            </w:r>
+          </w:p>
+        </w:tc>
+      </w:tr>
+      <w:tr>
+        <w:trPr>
+          <w:tblHeader w:val="false"/>
+        </w:trPr>
+        <w:tc>
+          <w:tcPr>
+            <w:tcW w:type="dxa" w:w="2800"/>
+            <w:tcBorders>
+              <w:top w:val="single" w:color="CCCCCC" w:sz="1"/>
+              <w:left w:val="single" w:color="CCCCCC" w:sz="1"/>
+              <w:bottom w:val="single" w:color="CCCCCC" w:sz="1"/>
+              <w:right w:val="single" w:color="CCCCCC" w:sz="1"/>
+            </w:tcBorders>
+            <w:shd w:fill="FFFFFF" w:val="clear"/>
+            <w:tcMar>
+              <w:top w:type="dxa" w:w="80"/>
+              <w:left w:type="dxa" w:w="140"/>
+              <w:bottom w:type="dxa" w:w="80"/>
+              <w:right w:type="dxa" w:w="140"/>
+            </w:tcMar>
+          </w:tcPr>
+          <w:p>
+            <w:r>
+              <w:rPr>
+                <w:rFonts w:ascii="Arial" w:cs="Arial" w:eastAsia="Arial" w:hAnsi="Arial"/>
+                <w:color w:val="1A1A1A"/>
+                <w:sz w:val="20"/>
+                <w:szCs w:val="20"/>
+              </w:rPr>
+              <w:t>PhysicalProfile</w:t>
+            </w:r>
+          </w:p>
+        </w:tc>
+        <w:tc>
+          <w:tcPr>
+            <w:tcW w:type="dxa" w:w="6560"/>
+            <w:tcBorders>
+              <w:top w:val="single" w:color="CCCCCC" w:sz="1"/>
+              <w:left w:val="single" w:color="CCCCCC" w:sz="1"/>
+              <w:bottom w:val="single" w:color="CCCCCC" w:sz="1"/>
+              <w:right w:val="single" w:color="CCCCCC" w:sz="1"/>
+            </w:tcBorders>
+            <w:shd w:fill="FFFFFF" w:val="clear"/>
+            <w:tcMar>
+              <w:top w:type="dxa" w:w="80"/>
+              <w:left w:type="dxa" w:w="140"/>
+              <w:bottom w:type="dxa" w:w="80"/>
+              <w:right w:type="dxa" w:w="140"/>
+            </w:tcMar>
+          </w:tcPr>
+          <w:p>
+            <w:r>
+              <w:rPr>
+                <w:rFonts w:ascii="Arial" w:cs="Arial" w:eastAsia="Arial" w:hAnsi="Arial"/>
+                <w:color w:val="1A1A1A"/>
+                <w:sz w:val="20"/>
+                <w:szCs w:val="20"/>
+              </w:rPr>
+              <w:t>Vettore float 0-1 per tratto fisico (Strength, Endurance, Agility, Intelligence). Cresce con esercizio e attività specifiche, cala con inattività prolungata o need critici. Cap superiore = NpcCapacities nel DNA. Introdotto in v0.04.09.</w:t>
             </w:r>
           </w:p>
         </w:tc>

</xml_diff>